<commit_message>
fix(toan): resolve math equation font errors and accent marks in Lop 7 docx exam files
</commit_message>
<xml_diff>
--- a/toan/lop-7/de-1/DE_KIEM_TRA_GIUA_KI_1_TOAN_7.docx
+++ b/toan/lop-7/de-1/DE_KIEM_TRA_GIUA_KI_1_TOAN_7.docx
@@ -178,12 +178,7 @@
     </w:tbl>
     <w:p>
       <w:pPr>
-        <w:spacing w:after="80"/>
-      </w:pPr>
-    </w:p>
-    <w:p>
-      <w:pPr>
-        <w:spacing w:before="120" w:after="60" w:line="288" w:lineRule="auto"/>
+        <w:spacing w:after="60" w:before="120" w:line="288" w:lineRule="auto"/>
         <w:jc w:val="left"/>
       </w:pPr>
       <w:r>
@@ -294,7 +289,6 @@
           <w:tcPr>
             <w:tcW w:type="dxa" w:w="2304"/>
           </w:tcPr>
-          <w:p/>
           <w:p>
             <w:pPr>
               <w:spacing w:before="20" w:after="40" w:line="288" w:lineRule="auto"/>
@@ -333,7 +327,6 @@
           <w:tcPr>
             <w:tcW w:type="dxa" w:w="2304"/>
           </w:tcPr>
-          <w:p/>
           <w:p>
             <w:pPr>
               <w:spacing w:before="20" w:after="40" w:line="288" w:lineRule="auto"/>
@@ -375,7 +368,6 @@
           <w:tcPr>
             <w:tcW w:type="dxa" w:w="2304"/>
           </w:tcPr>
-          <w:p/>
           <w:p>
             <w:pPr>
               <w:spacing w:before="20" w:after="40" w:line="288" w:lineRule="auto"/>
@@ -414,7 +406,6 @@
           <w:tcPr>
             <w:tcW w:type="dxa" w:w="2304"/>
           </w:tcPr>
-          <w:p/>
           <w:p>
             <w:pPr>
               <w:spacing w:before="20" w:after="40" w:line="288" w:lineRule="auto"/>
@@ -525,7 +516,6 @@
           <w:tcPr>
             <w:tcW w:type="dxa" w:w="2304"/>
           </w:tcPr>
-          <w:p/>
           <w:p>
             <w:pPr>
               <w:spacing w:before="20" w:after="40" w:line="288" w:lineRule="auto"/>
@@ -552,7 +542,6 @@
           <w:tcPr>
             <w:tcW w:type="dxa" w:w="2304"/>
           </w:tcPr>
-          <w:p/>
           <w:p>
             <w:pPr>
               <w:spacing w:before="20" w:after="40" w:line="288" w:lineRule="auto"/>
@@ -594,7 +583,6 @@
           <w:tcPr>
             <w:tcW w:type="dxa" w:w="2304"/>
           </w:tcPr>
-          <w:p/>
           <w:p>
             <w:pPr>
               <w:spacing w:before="20" w:after="40" w:line="288" w:lineRule="auto"/>
@@ -621,7 +609,6 @@
           <w:tcPr>
             <w:tcW w:type="dxa" w:w="2304"/>
           </w:tcPr>
-          <w:p/>
           <w:p>
             <w:pPr>
               <w:spacing w:before="20" w:after="40" w:line="288" w:lineRule="auto"/>
@@ -688,7 +675,13 @@
       </w:r>
       <m:oMath xmlns:mml="http://www.w3.org/1998/Math/MathML">
         <m:r>
-          <m:t>1,5</m:t>
+          <m:t>1</m:t>
+        </m:r>
+        <m:r>
+          <m:t>,</m:t>
+        </m:r>
+        <m:r>
+          <m:t>5</m:t>
         </m:r>
       </m:oMath>
       <w:r>
@@ -727,7 +720,6 @@
           <w:tcPr>
             <w:tcW w:type="dxa" w:w="2304"/>
           </w:tcPr>
-          <w:p/>
           <w:p>
             <w:pPr>
               <w:spacing w:before="20" w:after="40" w:line="288" w:lineRule="auto"/>
@@ -745,7 +737,13 @@
             </w:r>
             <m:oMath xmlns:mml="http://www.w3.org/1998/Math/MathML">
               <m:r>
-                <m:t>1,5</m:t>
+                <m:t>1</m:t>
+              </m:r>
+              <m:r>
+                <m:t>,</m:t>
+              </m:r>
+              <m:r>
+                <m:t>5</m:t>
               </m:r>
             </m:oMath>
           </w:p>
@@ -754,7 +752,6 @@
           <w:tcPr>
             <w:tcW w:type="dxa" w:w="2304"/>
           </w:tcPr>
-          <w:p/>
           <w:p>
             <w:pPr>
               <w:spacing w:before="20" w:after="40" w:line="288" w:lineRule="auto"/>
@@ -772,7 +769,13 @@
             </w:r>
             <m:oMath xmlns:mml="http://www.w3.org/1998/Math/MathML">
               <m:r>
-                <m:t>−1,5</m:t>
+                <m:t>−1</m:t>
+              </m:r>
+              <m:r>
+                <m:t>,</m:t>
+              </m:r>
+              <m:r>
+                <m:t>5</m:t>
               </m:r>
             </m:oMath>
           </w:p>
@@ -781,7 +784,6 @@
           <w:tcPr>
             <w:tcW w:type="dxa" w:w="2304"/>
           </w:tcPr>
-          <w:p/>
           <w:p>
             <w:pPr>
               <w:spacing w:before="20" w:after="40" w:line="288" w:lineRule="auto"/>
@@ -823,7 +825,6 @@
           <w:tcPr>
             <w:tcW w:type="dxa" w:w="2304"/>
           </w:tcPr>
-          <w:p/>
           <w:p>
             <w:pPr>
               <w:spacing w:before="20" w:after="40" w:line="288" w:lineRule="auto"/>
@@ -968,7 +969,6 @@
           <w:tcPr>
             <w:tcW w:type="dxa" w:w="2304"/>
           </w:tcPr>
-          <w:p/>
           <w:p>
             <w:pPr>
               <w:spacing w:before="20" w:after="40" w:line="288" w:lineRule="auto"/>
@@ -1004,7 +1004,6 @@
           <w:tcPr>
             <w:tcW w:type="dxa" w:w="2304"/>
           </w:tcPr>
-          <w:p/>
           <w:p>
             <w:pPr>
               <w:spacing w:before="20" w:after="40" w:line="288" w:lineRule="auto"/>
@@ -1040,7 +1039,6 @@
           <w:tcPr>
             <w:tcW w:type="dxa" w:w="2304"/>
           </w:tcPr>
-          <w:p/>
           <w:p>
             <w:pPr>
               <w:spacing w:before="20" w:after="40" w:line="288" w:lineRule="auto"/>
@@ -1076,7 +1074,6 @@
           <w:tcPr>
             <w:tcW w:type="dxa" w:w="2304"/>
           </w:tcPr>
-          <w:p/>
           <w:p>
             <w:pPr>
               <w:spacing w:before="20" w:after="40" w:line="288" w:lineRule="auto"/>
@@ -1206,7 +1203,6 @@
           <w:tcPr>
             <w:tcW w:type="dxa" w:w="2304"/>
           </w:tcPr>
-          <w:p/>
           <w:p>
             <w:pPr>
               <w:spacing w:before="20" w:after="40" w:line="288" w:lineRule="auto"/>
@@ -1248,7 +1244,6 @@
           <w:tcPr>
             <w:tcW w:type="dxa" w:w="2304"/>
           </w:tcPr>
-          <w:p/>
           <w:p>
             <w:pPr>
               <w:spacing w:before="20" w:after="40" w:line="288" w:lineRule="auto"/>
@@ -1287,7 +1282,6 @@
           <w:tcPr>
             <w:tcW w:type="dxa" w:w="2304"/>
           </w:tcPr>
-          <w:p/>
           <w:p>
             <w:pPr>
               <w:spacing w:before="20" w:after="40" w:line="288" w:lineRule="auto"/>
@@ -1329,7 +1323,6 @@
           <w:tcPr>
             <w:tcW w:type="dxa" w:w="2304"/>
           </w:tcPr>
-          <w:p/>
           <w:p>
             <w:pPr>
               <w:spacing w:before="20" w:after="40" w:line="288" w:lineRule="auto"/>
@@ -1432,7 +1425,6 @@
           <w:tcPr>
             <w:tcW w:type="dxa" w:w="2304"/>
           </w:tcPr>
-          <w:p/>
           <w:p>
             <w:pPr>
               <w:spacing w:before="20" w:after="40" w:line="288" w:lineRule="auto"/>
@@ -1459,7 +1451,6 @@
           <w:tcPr>
             <w:tcW w:type="dxa" w:w="2304"/>
           </w:tcPr>
-          <w:p/>
           <w:p>
             <w:pPr>
               <w:spacing w:before="20" w:after="40" w:line="288" w:lineRule="auto"/>
@@ -1486,7 +1477,6 @@
           <w:tcPr>
             <w:tcW w:type="dxa" w:w="2304"/>
           </w:tcPr>
-          <w:p/>
           <w:p>
             <w:pPr>
               <w:spacing w:before="20" w:after="40" w:line="288" w:lineRule="auto"/>
@@ -1513,7 +1503,6 @@
           <w:tcPr>
             <w:tcW w:type="dxa" w:w="2304"/>
           </w:tcPr>
-          <w:p/>
           <w:p>
             <w:pPr>
               <w:spacing w:before="20" w:after="40" w:line="288" w:lineRule="auto"/>
@@ -1604,7 +1593,6 @@
           <w:tcPr>
             <w:tcW w:type="dxa" w:w="2304"/>
           </w:tcPr>
-          <w:p/>
           <w:p>
             <w:pPr>
               <w:spacing w:before="20" w:after="40" w:line="288" w:lineRule="auto"/>
@@ -1661,7 +1649,6 @@
           <w:tcPr>
             <w:tcW w:type="dxa" w:w="2304"/>
           </w:tcPr>
-          <w:p/>
           <w:p>
             <w:pPr>
               <w:spacing w:before="20" w:after="40" w:line="288" w:lineRule="auto"/>
@@ -1718,7 +1705,6 @@
           <w:tcPr>
             <w:tcW w:type="dxa" w:w="2304"/>
           </w:tcPr>
-          <w:p/>
           <w:p>
             <w:pPr>
               <w:spacing w:before="20" w:after="40" w:line="288" w:lineRule="auto"/>
@@ -1775,7 +1761,6 @@
           <w:tcPr>
             <w:tcW w:type="dxa" w:w="2304"/>
           </w:tcPr>
-          <w:p/>
           <w:p>
             <w:pPr>
               <w:spacing w:before="20" w:after="40" w:line="288" w:lineRule="auto"/>
@@ -1896,7 +1881,6 @@
           <w:tcPr>
             <w:tcW w:type="dxa" w:w="2304"/>
           </w:tcPr>
-          <w:p/>
           <w:p>
             <w:pPr>
               <w:spacing w:before="20" w:after="40" w:line="288" w:lineRule="auto"/>
@@ -1932,7 +1916,6 @@
           <w:tcPr>
             <w:tcW w:type="dxa" w:w="2304"/>
           </w:tcPr>
-          <w:p/>
           <w:p>
             <w:pPr>
               <w:spacing w:before="20" w:after="40" w:line="288" w:lineRule="auto"/>
@@ -1954,7 +1937,6 @@
           <w:tcPr>
             <w:tcW w:type="dxa" w:w="2304"/>
           </w:tcPr>
-          <w:p/>
           <w:p>
             <w:pPr>
               <w:spacing w:before="20" w:after="40" w:line="288" w:lineRule="auto"/>
@@ -1976,7 +1958,6 @@
           <w:tcPr>
             <w:tcW w:type="dxa" w:w="2304"/>
           </w:tcPr>
-          <w:p/>
           <w:p>
             <w:pPr>
               <w:spacing w:before="20" w:after="40" w:line="288" w:lineRule="auto"/>
@@ -2036,18 +2017,16 @@
         <w:t xml:space="preserve"> Cho hai góc </w:t>
       </w:r>
       <m:oMath xmlns:mml="http://www.w3.org/1998/Math/MathML">
-        <m:limUpp>
+        <m:acc>
+          <m:accPr>
+            <m:chr m:val="̂"/>
+          </m:accPr>
           <m:e>
             <m:r>
               <m:t>xOy</m:t>
             </m:r>
           </m:e>
-          <m:lim>
-            <m:r>
-              <m:t>^</m:t>
-            </m:r>
-          </m:lim>
-        </m:limUpp>
+        </m:acc>
       </m:oMath>
       <w:r>
         <w:rPr>
@@ -2060,18 +2039,16 @@
         <w:t xml:space="preserve"> và </w:t>
       </w:r>
       <m:oMath xmlns:mml="http://www.w3.org/1998/Math/MathML">
-        <m:limUpp>
+        <m:acc>
+          <m:accPr>
+            <m:chr m:val="̂"/>
+          </m:accPr>
           <m:e>
             <m:r>
               <m:t>yOz</m:t>
             </m:r>
           </m:e>
-          <m:lim>
-            <m:r>
-              <m:t>^</m:t>
-            </m:r>
-          </m:lim>
-        </m:limUpp>
+        </m:acc>
       </m:oMath>
       <w:r>
         <w:rPr>
@@ -2084,18 +2061,16 @@
         <w:t xml:space="preserve"> là hai góc kề bù. Biết </w:t>
       </w:r>
       <m:oMath xmlns:mml="http://www.w3.org/1998/Math/MathML">
-        <m:limUpp>
+        <m:acc>
+          <m:accPr>
+            <m:chr m:val="̂"/>
+          </m:accPr>
           <m:e>
             <m:r>
               <m:t>xOy</m:t>
             </m:r>
           </m:e>
-          <m:lim>
-            <m:r>
-              <m:t>^</m:t>
-            </m:r>
-          </m:lim>
-        </m:limUpp>
+        </m:acc>
         <m:r>
           <m:t>=</m:t>
         </m:r>
@@ -2123,18 +2098,16 @@
         <w:t xml:space="preserve">, số đo của góc </w:t>
       </w:r>
       <m:oMath xmlns:mml="http://www.w3.org/1998/Math/MathML">
-        <m:limUpp>
+        <m:acc>
+          <m:accPr>
+            <m:chr m:val="̂"/>
+          </m:accPr>
           <m:e>
             <m:r>
               <m:t>yOz</m:t>
             </m:r>
           </m:e>
-          <m:lim>
-            <m:r>
-              <m:t>^</m:t>
-            </m:r>
-          </m:lim>
-        </m:limUpp>
+        </m:acc>
       </m:oMath>
       <w:r>
         <w:rPr>
@@ -2172,7 +2145,6 @@
           <w:tcPr>
             <w:tcW w:type="dxa" w:w="2304"/>
           </w:tcPr>
-          <w:p/>
           <w:p>
             <w:pPr>
               <w:spacing w:before="20" w:after="40" w:line="288" w:lineRule="auto"/>
@@ -2208,7 +2180,6 @@
           <w:tcPr>
             <w:tcW w:type="dxa" w:w="2304"/>
           </w:tcPr>
-          <w:p/>
           <w:p>
             <w:pPr>
               <w:spacing w:before="20" w:after="40" w:line="288" w:lineRule="auto"/>
@@ -2244,7 +2215,6 @@
           <w:tcPr>
             <w:tcW w:type="dxa" w:w="2304"/>
           </w:tcPr>
-          <w:p/>
           <w:p>
             <w:pPr>
               <w:spacing w:before="20" w:after="40" w:line="288" w:lineRule="auto"/>
@@ -2280,7 +2250,6 @@
           <w:tcPr>
             <w:tcW w:type="dxa" w:w="2304"/>
           </w:tcPr>
-          <w:p/>
           <w:p>
             <w:pPr>
               <w:spacing w:before="20" w:after="40" w:line="288" w:lineRule="auto"/>
@@ -2355,18 +2324,16 @@
         <w:t xml:space="preserve"> là tia phân giác của góc </w:t>
       </w:r>
       <m:oMath xmlns:mml="http://www.w3.org/1998/Math/MathML">
-        <m:limUpp>
+        <m:acc>
+          <m:accPr>
+            <m:chr m:val="̂"/>
+          </m:accPr>
           <m:e>
             <m:r>
               <m:t>mOn</m:t>
             </m:r>
           </m:e>
-          <m:lim>
-            <m:r>
-              <m:t>^</m:t>
-            </m:r>
-          </m:lim>
-        </m:limUpp>
+        </m:acc>
       </m:oMath>
       <w:r>
         <w:rPr>
@@ -2379,18 +2346,16 @@
         <w:t xml:space="preserve">. Biết </w:t>
       </w:r>
       <m:oMath xmlns:mml="http://www.w3.org/1998/Math/MathML">
-        <m:limUpp>
+        <m:acc>
+          <m:accPr>
+            <m:chr m:val="̂"/>
+          </m:accPr>
           <m:e>
             <m:r>
               <m:t>mOn</m:t>
             </m:r>
           </m:e>
-          <m:lim>
-            <m:r>
-              <m:t>^</m:t>
-            </m:r>
-          </m:lim>
-        </m:limUpp>
+        </m:acc>
         <m:r>
           <m:t>=</m:t>
         </m:r>
@@ -2418,18 +2383,16 @@
         <w:t xml:space="preserve">, số đo của góc </w:t>
       </w:r>
       <m:oMath xmlns:mml="http://www.w3.org/1998/Math/MathML">
-        <m:limUpp>
+        <m:acc>
+          <m:accPr>
+            <m:chr m:val="̂"/>
+          </m:accPr>
           <m:e>
             <m:r>
               <m:t>mOt</m:t>
             </m:r>
           </m:e>
-          <m:lim>
-            <m:r>
-              <m:t>^</m:t>
-            </m:r>
-          </m:lim>
-        </m:limUpp>
+        </m:acc>
       </m:oMath>
       <w:r>
         <w:rPr>
@@ -2467,7 +2430,6 @@
           <w:tcPr>
             <w:tcW w:type="dxa" w:w="2304"/>
           </w:tcPr>
-          <w:p/>
           <w:p>
             <w:pPr>
               <w:spacing w:before="20" w:after="40" w:line="288" w:lineRule="auto"/>
@@ -2503,7 +2465,6 @@
           <w:tcPr>
             <w:tcW w:type="dxa" w:w="2304"/>
           </w:tcPr>
-          <w:p/>
           <w:p>
             <w:pPr>
               <w:spacing w:before="20" w:after="40" w:line="288" w:lineRule="auto"/>
@@ -2539,7 +2500,6 @@
           <w:tcPr>
             <w:tcW w:type="dxa" w:w="2304"/>
           </w:tcPr>
-          <w:p/>
           <w:p>
             <w:pPr>
               <w:spacing w:before="20" w:after="40" w:line="288" w:lineRule="auto"/>
@@ -2575,7 +2535,6 @@
           <w:tcPr>
             <w:tcW w:type="dxa" w:w="2304"/>
           </w:tcPr>
-          <w:p/>
           <w:p>
             <w:pPr>
               <w:spacing w:before="20" w:after="40" w:line="288" w:lineRule="auto"/>
@@ -2759,7 +2718,6 @@
           <w:tcPr>
             <w:tcW w:type="dxa" w:w="2304"/>
           </w:tcPr>
-          <w:p/>
           <w:p>
             <w:pPr>
               <w:spacing w:before="20" w:after="40" w:line="288" w:lineRule="auto"/>
@@ -2795,7 +2753,6 @@
           <w:tcPr>
             <w:tcW w:type="dxa" w:w="2304"/>
           </w:tcPr>
-          <w:p/>
           <w:p>
             <w:pPr>
               <w:spacing w:before="20" w:after="40" w:line="288" w:lineRule="auto"/>
@@ -2831,7 +2788,6 @@
           <w:tcPr>
             <w:tcW w:type="dxa" w:w="2304"/>
           </w:tcPr>
-          <w:p/>
           <w:p>
             <w:pPr>
               <w:spacing w:before="20" w:after="40" w:line="288" w:lineRule="auto"/>
@@ -2867,7 +2823,6 @@
           <w:tcPr>
             <w:tcW w:type="dxa" w:w="2304"/>
           </w:tcPr>
-          <w:p/>
           <w:p>
             <w:pPr>
               <w:spacing w:before="20" w:after="40" w:line="288" w:lineRule="auto"/>
@@ -3003,7 +2958,6 @@
           <w:tcPr>
             <w:tcW w:type="dxa" w:w="2304"/>
           </w:tcPr>
-          <w:p/>
           <w:p>
             <w:pPr>
               <w:spacing w:before="20" w:after="40" w:line="288" w:lineRule="auto"/>
@@ -3042,7 +2996,6 @@
           <w:tcPr>
             <w:tcW w:type="dxa" w:w="2304"/>
           </w:tcPr>
-          <w:p/>
           <w:p>
             <w:pPr>
               <w:spacing w:before="20" w:after="40" w:line="288" w:lineRule="auto"/>
@@ -3081,7 +3034,6 @@
           <w:tcPr>
             <w:tcW w:type="dxa" w:w="2304"/>
           </w:tcPr>
-          <w:p/>
           <w:p>
             <w:pPr>
               <w:spacing w:before="20" w:after="40" w:line="288" w:lineRule="auto"/>
@@ -3120,7 +3072,6 @@
           <w:tcPr>
             <w:tcW w:type="dxa" w:w="2304"/>
           </w:tcPr>
-          <w:p/>
           <w:p>
             <w:pPr>
               <w:spacing w:before="20" w:after="40" w:line="288" w:lineRule="auto"/>
@@ -3344,11 +3295,73 @@
         </w:rPr>
         <w:t xml:space="preserve">    </w:t>
       </w:r>
-      <m:oMath>
+      <m:oMath xmlns:mml="http://www.w3.org/1998/Math/MathML">
         <m:r>
-          <m:t>B = \left(2^3 \cdot 2^2
-ight) : 2^4 + (-2023)^0</m:t>
+          <m:t>B=</m:t>
         </m:r>
+        <m:r>
+          <m:t>(</m:t>
+        </m:r>
+        <m:sSup>
+          <m:e>
+            <m:r>
+              <m:t>2</m:t>
+            </m:r>
+          </m:e>
+          <m:sup>
+            <m:r>
+              <m:t>3</m:t>
+            </m:r>
+          </m:sup>
+        </m:sSup>
+        <m:r>
+          <m:t>·</m:t>
+        </m:r>
+        <m:sSup>
+          <m:e>
+            <m:r>
+              <m:t>2</m:t>
+            </m:r>
+          </m:e>
+          <m:sup>
+            <m:r>
+              <m:t>2</m:t>
+            </m:r>
+          </m:sup>
+        </m:sSup>
+        <m:r>
+          <m:t>)</m:t>
+        </m:r>
+        <m:r>
+          <m:t>:</m:t>
+        </m:r>
+        <m:sSup>
+          <m:e>
+            <m:r>
+              <m:t>2</m:t>
+            </m:r>
+          </m:e>
+          <m:sup>
+            <m:r>
+              <m:t>4</m:t>
+            </m:r>
+          </m:sup>
+        </m:sSup>
+        <m:r>
+          <m:t>+(−2023</m:t>
+        </m:r>
+        <m:sSup>
+          <m:e>
+            <m:r>
+              <m:t>)</m:t>
+            </m:r>
+          </m:e>
+          <m:sup>
+            <m:r>
+              <m:t>0</m:t>
+            </m:r>
+          </m:sup>
+        </m:sSup>
       </m:oMath>
     </w:p>
     <w:p>
@@ -3685,18 +3698,16 @@
         <w:t xml:space="preserve"> sao cho góc </w:t>
       </w:r>
       <m:oMath xmlns:mml="http://www.w3.org/1998/Math/MathML">
-        <m:limUpp>
+        <m:acc>
+          <m:accPr>
+            <m:chr m:val="̂"/>
+          </m:accPr>
           <m:e>
             <m:r>
               <m:t>xOz</m:t>
             </m:r>
           </m:e>
-          <m:lim>
-            <m:r>
-              <m:t>^</m:t>
-            </m:r>
-          </m:lim>
-        </m:limUpp>
+        </m:acc>
         <m:r>
           <m:t>=</m:t>
         </m:r>
@@ -3739,18 +3750,16 @@
         <w:t xml:space="preserve"> là tia phân giác của góc </w:t>
       </w:r>
       <m:oMath xmlns:mml="http://www.w3.org/1998/Math/MathML">
-        <m:limUpp>
+        <m:acc>
+          <m:accPr>
+            <m:chr m:val="̂"/>
+          </m:accPr>
           <m:e>
             <m:r>
               <m:t>xOz</m:t>
             </m:r>
           </m:e>
-          <m:lim>
-            <m:r>
-              <m:t>^</m:t>
-            </m:r>
-          </m:lim>
-        </m:limUpp>
+        </m:acc>
       </m:oMath>
       <w:r>
         <w:rPr>
@@ -3825,18 +3834,16 @@
         <w:t xml:space="preserve">    [   ] a) Góc </w:t>
       </w:r>
       <m:oMath xmlns:mml="http://www.w3.org/1998/Math/MathML">
-        <m:limUpp>
+        <m:acc>
+          <m:accPr>
+            <m:chr m:val="̂"/>
+          </m:accPr>
           <m:e>
             <m:r>
               <m:t>yOt</m:t>
             </m:r>
           </m:e>
-          <m:lim>
-            <m:r>
-              <m:t>^</m:t>
-            </m:r>
-          </m:lim>
-        </m:limUpp>
+        </m:acc>
       </m:oMath>
       <w:r>
         <w:rPr>
@@ -3849,18 +3856,16 @@
         <w:t xml:space="preserve"> và góc </w:t>
       </w:r>
       <m:oMath xmlns:mml="http://www.w3.org/1998/Math/MathML">
-        <m:limUpp>
+        <m:acc>
+          <m:accPr>
+            <m:chr m:val="̂"/>
+          </m:accPr>
           <m:e>
             <m:r>
               <m:t>xOz</m:t>
             </m:r>
           </m:e>
-          <m:lim>
-            <m:r>
-              <m:t>^</m:t>
-            </m:r>
-          </m:lim>
-        </m:limUpp>
+        </m:acc>
       </m:oMath>
       <w:r>
         <w:rPr>
@@ -3873,18 +3878,16 @@
         <w:t xml:space="preserve"> là hai góc đối đỉnh nên </w:t>
       </w:r>
       <m:oMath xmlns:mml="http://www.w3.org/1998/Math/MathML">
-        <m:limUpp>
+        <m:acc>
+          <m:accPr>
+            <m:chr m:val="̂"/>
+          </m:accPr>
           <m:e>
             <m:r>
               <m:t>yOt</m:t>
             </m:r>
           </m:e>
-          <m:lim>
-            <m:r>
-              <m:t>^</m:t>
-            </m:r>
-          </m:lim>
-        </m:limUpp>
+        </m:acc>
         <m:r>
           <m:t>=</m:t>
         </m:r>
@@ -3928,18 +3931,16 @@
         <w:t xml:space="preserve">    [   ] b) Góc </w:t>
       </w:r>
       <m:oMath xmlns:mml="http://www.w3.org/1998/Math/MathML">
-        <m:limUpp>
+        <m:acc>
+          <m:accPr>
+            <m:chr m:val="̂"/>
+          </m:accPr>
           <m:e>
             <m:r>
               <m:t>xOt</m:t>
             </m:r>
           </m:e>
-          <m:lim>
-            <m:r>
-              <m:t>^</m:t>
-            </m:r>
-          </m:lim>
-        </m:limUpp>
+        </m:acc>
       </m:oMath>
       <w:r>
         <w:rPr>
@@ -4007,18 +4008,16 @@
         <w:t xml:space="preserve"> là tia phân giác của </w:t>
       </w:r>
       <m:oMath xmlns:mml="http://www.w3.org/1998/Math/MathML">
-        <m:limUpp>
+        <m:acc>
+          <m:accPr>
+            <m:chr m:val="̂"/>
+          </m:accPr>
           <m:e>
             <m:r>
               <m:t>xOz</m:t>
             </m:r>
           </m:e>
-          <m:lim>
-            <m:r>
-              <m:t>^</m:t>
-            </m:r>
-          </m:lim>
-        </m:limUpp>
+        </m:acc>
       </m:oMath>
       <w:r>
         <w:rPr>
@@ -4031,18 +4030,16 @@
         <w:t xml:space="preserve"> nên </w:t>
       </w:r>
       <m:oMath xmlns:mml="http://www.w3.org/1998/Math/MathML">
-        <m:limUpp>
+        <m:acc>
+          <m:accPr>
+            <m:chr m:val="̂"/>
+          </m:accPr>
           <m:e>
             <m:r>
               <m:t>xOm</m:t>
             </m:r>
           </m:e>
-          <m:lim>
-            <m:r>
-              <m:t>^</m:t>
-            </m:r>
-          </m:lim>
-        </m:limUpp>
+        </m:acc>
         <m:r>
           <m:t>=</m:t>
         </m:r>
@@ -4101,18 +4098,16 @@
         <w:t xml:space="preserve"> không phải là tia phân giác của góc </w:t>
       </w:r>
       <m:oMath xmlns:mml="http://www.w3.org/1998/Math/MathML">
-        <m:limUpp>
+        <m:acc>
+          <m:accPr>
+            <m:chr m:val="̂"/>
+          </m:accPr>
           <m:e>
             <m:r>
               <m:t>yOt</m:t>
             </m:r>
           </m:e>
-          <m:lim>
-            <m:r>
-              <m:t>^</m:t>
-            </m:r>
-          </m:lim>
-        </m:limUpp>
+        </m:acc>
       </m:oMath>
       <w:r>
         <w:rPr>
@@ -4934,7 +4929,7 @@
     </w:p>
     <w:p>
       <w:pPr>
-        <w:spacing w:before="40" w:after="60" w:line="288" w:lineRule="auto"/>
+        <w:spacing w:before="40" w:after="20" w:line="288" w:lineRule="auto"/>
         <w:jc w:val="left"/>
       </w:pPr>
       <w:r>
@@ -4979,7 +4974,21 @@
           <w:sz w:val="23"/>
         </w:rPr>
         <w:t xml:space="preserve"> đồng/chiếc.</w:t>
-        <w:br/>
+      </w:r>
+    </w:p>
+    <w:p>
+      <w:pPr>
+        <w:spacing w:before="20" w:after="20" w:line="288" w:lineRule="auto"/>
+        <w:jc w:val="left"/>
+      </w:pPr>
+      <w:r>
+        <w:rPr>
+          <w:rFonts w:ascii="Times New Roman" w:hAnsi="Times New Roman"/>
+          <w:b w:val="0"/>
+          <w:i w:val="0"/>
+          <w:color w:val="000000"/>
+          <w:sz w:val="23"/>
+        </w:rPr>
         <w:t xml:space="preserve">    - Đợt 1: Cửa hàng bán được </w:t>
       </w:r>
       <m:oMath xmlns:mml="http://www.w3.org/1998/Math/MathML">
@@ -5011,7 +5020,21 @@
           <w:sz w:val="23"/>
         </w:rPr>
         <w:t xml:space="preserve"> so với giá vốn.</w:t>
-        <w:br/>
+      </w:r>
+    </w:p>
+    <w:p>
+      <w:pPr>
+        <w:spacing w:before="20" w:after="20" w:line="288" w:lineRule="auto"/>
+        <w:jc w:val="left"/>
+      </w:pPr>
+      <w:r>
+        <w:rPr>
+          <w:rFonts w:ascii="Times New Roman" w:hAnsi="Times New Roman"/>
+          <w:b w:val="0"/>
+          <w:i w:val="0"/>
+          <w:color w:val="000000"/>
+          <w:sz w:val="23"/>
+        </w:rPr>
         <w:t xml:space="preserve">    - Đợt 2: Để thanh lý hết số còn lại, cửa hàng giảm giá </w:t>
       </w:r>
       <m:oMath xmlns:mml="http://www.w3.org/1998/Math/MathML">
@@ -5043,7 +5066,21 @@
           <w:sz w:val="23"/>
         </w:rPr>
         <w:t xml:space="preserve"> chiếc còn lại.</w:t>
-        <w:br/>
+      </w:r>
+    </w:p>
+    <w:p>
+      <w:pPr>
+        <w:spacing w:before="20" w:after="20" w:line="288" w:lineRule="auto"/>
+        <w:jc w:val="left"/>
+      </w:pPr>
+      <w:r>
+        <w:rPr>
+          <w:rFonts w:ascii="Times New Roman" w:hAnsi="Times New Roman"/>
+          <w:b w:val="0"/>
+          <w:i w:val="0"/>
+          <w:color w:val="000000"/>
+          <w:sz w:val="23"/>
+        </w:rPr>
         <w:t xml:space="preserve">    a) </w:t>
       </w:r>
       <w:r>
@@ -5065,7 +5102,21 @@
           <w:sz w:val="23"/>
         </w:rPr>
         <w:t xml:space="preserve"> Tính giá bán của một chiếc máy tính ở Đợt 1 và ở Đợt 2.</w:t>
-        <w:br/>
+      </w:r>
+    </w:p>
+    <w:p>
+      <w:pPr>
+        <w:spacing w:before="20" w:after="60" w:line="288" w:lineRule="auto"/>
+        <w:jc w:val="left"/>
+      </w:pPr>
+      <w:r>
+        <w:rPr>
+          <w:rFonts w:ascii="Times New Roman" w:hAnsi="Times New Roman"/>
+          <w:b w:val="0"/>
+          <w:i w:val="0"/>
+          <w:color w:val="000000"/>
+          <w:sz w:val="23"/>
+        </w:rPr>
         <w:t xml:space="preserve">    b) </w:t>
       </w:r>
       <w:r>
@@ -5122,7 +5173,7 @@
     </w:p>
     <w:p>
       <w:pPr>
-        <w:spacing w:before="40" w:after="60" w:line="288" w:lineRule="auto"/>
+        <w:spacing w:before="40" w:after="20" w:line="288" w:lineRule="auto"/>
         <w:jc w:val="left"/>
       </w:pPr>
       <w:r>
@@ -5241,18 +5292,16 @@
         <w:t xml:space="preserve"> sao cho </w:t>
       </w:r>
       <m:oMath xmlns:mml="http://www.w3.org/1998/Math/MathML">
-        <m:limUpp>
+        <m:acc>
+          <m:accPr>
+            <m:chr m:val="̂"/>
+          </m:accPr>
           <m:e>
             <m:r>
               <m:t>xAB</m:t>
             </m:r>
           </m:e>
-          <m:lim>
-            <m:r>
-              <m:t>^</m:t>
-            </m:r>
-          </m:lim>
-        </m:limUpp>
+        </m:acc>
         <m:r>
           <m:t>=</m:t>
         </m:r>
@@ -5280,7 +5329,10 @@
         <w:t xml:space="preserve"> và </w:t>
       </w:r>
       <m:oMath xmlns:mml="http://www.w3.org/1998/Math/MathML">
-        <m:limUpp>
+        <m:acc>
+          <m:accPr>
+            <m:chr m:val="̂"/>
+          </m:accPr>
           <m:e>
             <m:r>
               <m:t>AB</m:t>
@@ -5298,12 +5350,7 @@
               </m:sup>
             </m:sSup>
           </m:e>
-          <m:lim>
-            <m:r>
-              <m:t>^</m:t>
-            </m:r>
-          </m:lim>
-        </m:limUpp>
+        </m:acc>
         <m:r>
           <m:t>=</m:t>
         </m:r>
@@ -5373,18 +5420,16 @@
         <w:t xml:space="preserve">; hai góc </w:t>
       </w:r>
       <m:oMath xmlns:mml="http://www.w3.org/1998/Math/MathML">
-        <m:limUpp>
+        <m:acc>
+          <m:accPr>
+            <m:chr m:val="̂"/>
+          </m:accPr>
           <m:e>
             <m:r>
               <m:t>xAB</m:t>
             </m:r>
           </m:e>
-          <m:lim>
-            <m:r>
-              <m:t>^</m:t>
-            </m:r>
-          </m:lim>
-        </m:limUpp>
+        </m:acc>
       </m:oMath>
       <w:r>
         <w:rPr>
@@ -5397,7 +5442,10 @@
         <w:t xml:space="preserve"> và </w:t>
       </w:r>
       <m:oMath xmlns:mml="http://www.w3.org/1998/Math/MathML">
-        <m:limUpp>
+        <m:acc>
+          <m:accPr>
+            <m:chr m:val="̂"/>
+          </m:accPr>
           <m:e>
             <m:r>
               <m:t>AB</m:t>
@@ -5415,12 +5463,7 @@
               </m:sup>
             </m:sSup>
           </m:e>
-          <m:lim>
-            <m:r>
-              <m:t>^</m:t>
-            </m:r>
-          </m:lim>
-        </m:limUpp>
+        </m:acc>
       </m:oMath>
       <w:r>
         <w:rPr>
@@ -5431,7 +5474,21 @@
           <w:sz w:val="23"/>
         </w:rPr>
         <w:t xml:space="preserve"> ở vị trí so le trong).</w:t>
-        <w:br/>
+      </w:r>
+    </w:p>
+    <w:p>
+      <w:pPr>
+        <w:spacing w:before="20" w:after="20" w:line="288" w:lineRule="auto"/>
+        <w:jc w:val="left"/>
+      </w:pPr>
+      <w:r>
+        <w:rPr>
+          <w:rFonts w:ascii="Times New Roman" w:hAnsi="Times New Roman"/>
+          <w:b w:val="0"/>
+          <w:i w:val="0"/>
+          <w:color w:val="000000"/>
+          <w:sz w:val="23"/>
+        </w:rPr>
         <w:t xml:space="preserve">    a) </w:t>
       </w:r>
       <w:r>
@@ -5483,7 +5540,21 @@
           <w:sz w:val="23"/>
         </w:rPr>
         <w:t>.</w:t>
-        <w:br/>
+      </w:r>
+    </w:p>
+    <w:p>
+      <w:pPr>
+        <w:spacing w:before="20" w:after="60" w:line="288" w:lineRule="auto"/>
+        <w:jc w:val="left"/>
+      </w:pPr>
+      <w:r>
+        <w:rPr>
+          <w:rFonts w:ascii="Times New Roman" w:hAnsi="Times New Roman"/>
+          <w:b w:val="0"/>
+          <w:i w:val="0"/>
+          <w:color w:val="000000"/>
+          <w:sz w:val="23"/>
+        </w:rPr>
         <w:t xml:space="preserve">    b) </w:t>
       </w:r>
       <w:r>
@@ -5522,18 +5593,16 @@
         <w:t xml:space="preserve"> là tia phân giác của </w:t>
       </w:r>
       <m:oMath xmlns:mml="http://www.w3.org/1998/Math/MathML">
-        <m:limUpp>
+        <m:acc>
+          <m:accPr>
+            <m:chr m:val="̂"/>
+          </m:accPr>
           <m:e>
             <m:r>
               <m:t>xAB</m:t>
             </m:r>
           </m:e>
-          <m:lim>
-            <m:r>
-              <m:t>^</m:t>
-            </m:r>
-          </m:lim>
-        </m:limUpp>
+        </m:acc>
       </m:oMath>
       <w:r>
         <w:rPr>
@@ -5561,7 +5630,10 @@
         <w:t xml:space="preserve"> là tia phân giác của </w:t>
       </w:r>
       <m:oMath xmlns:mml="http://www.w3.org/1998/Math/MathML">
-        <m:limUpp>
+        <m:acc>
+          <m:accPr>
+            <m:chr m:val="̂"/>
+          </m:accPr>
           <m:e>
             <m:r>
               <m:t>AB</m:t>
@@ -5579,12 +5651,7 @@
               </m:sup>
             </m:sSup>
           </m:e>
-          <m:lim>
-            <m:r>
-              <m:t>^</m:t>
-            </m:r>
-          </m:lim>
-        </m:limUpp>
+        </m:acc>
       </m:oMath>
       <w:r>
         <w:rPr>
@@ -6159,7 +6226,7 @@
     </w:p>
     <w:p>
       <w:pPr>
-        <w:spacing w:before="40" w:after="60" w:line="288" w:lineRule="auto"/>
+        <w:spacing w:before="40" w:after="20" w:line="288" w:lineRule="auto"/>
         <w:jc w:val="left"/>
       </w:pPr>
       <w:r>
@@ -6191,7 +6258,21 @@
           <w:sz w:val="23"/>
         </w:rPr>
         <w:t xml:space="preserve"> a) ĐÚNG    b) ĐÚNG    c) SAI    d) ĐÚNG</w:t>
-        <w:br/>
+      </w:r>
+    </w:p>
+    <w:p>
+      <w:pPr>
+        <w:spacing w:before="20" w:after="60" w:line="288" w:lineRule="auto"/>
+        <w:jc w:val="left"/>
+      </w:pPr>
+      <w:r>
+        <w:rPr>
+          <w:rFonts w:ascii="Times New Roman" w:hAnsi="Times New Roman"/>
+          <w:b w:val="0"/>
+          <w:i w:val="0"/>
+          <w:color w:val="000000"/>
+          <w:sz w:val="23"/>
+        </w:rPr>
         <w:t xml:space="preserve">  *(Ý c sai vì </w:t>
       </w:r>
       <m:oMath xmlns:mml="http://www.w3.org/1998/Math/MathML">
@@ -6230,7 +6311,7 @@
     </w:p>
     <w:p>
       <w:pPr>
-        <w:spacing w:before="40" w:after="60" w:line="288" w:lineRule="auto"/>
+        <w:spacing w:before="40" w:after="20" w:line="288" w:lineRule="auto"/>
         <w:jc w:val="left"/>
       </w:pPr>
       <w:r>
@@ -6262,7 +6343,21 @@
           <w:sz w:val="23"/>
         </w:rPr>
         <w:t xml:space="preserve"> a) ĐÚNG    b) ĐÚNG    c) ĐÚNG    d) SAI</w:t>
-        <w:br/>
+      </w:r>
+    </w:p>
+    <w:p>
+      <w:pPr>
+        <w:spacing w:before="20" w:after="60" w:line="288" w:lineRule="auto"/>
+        <w:jc w:val="left"/>
+      </w:pPr>
+      <w:r>
+        <w:rPr>
+          <w:rFonts w:ascii="Times New Roman" w:hAnsi="Times New Roman"/>
+          <w:b w:val="0"/>
+          <w:i w:val="0"/>
+          <w:color w:val="000000"/>
+          <w:sz w:val="23"/>
+        </w:rPr>
         <w:t xml:space="preserve">  *(Ý d sai vì </w:t>
       </w:r>
       <m:oMath xmlns:mml="http://www.w3.org/1998/Math/MathML">
@@ -6281,18 +6376,16 @@
         <w:t xml:space="preserve"> chính là tia phân giác của </w:t>
       </w:r>
       <m:oMath xmlns:mml="http://www.w3.org/1998/Math/MathML">
-        <m:limUpp>
+        <m:acc>
+          <m:accPr>
+            <m:chr m:val="̂"/>
+          </m:accPr>
           <m:e>
             <m:r>
               <m:t>yOt</m:t>
             </m:r>
           </m:e>
-          <m:lim>
-            <m:r>
-              <m:t>^</m:t>
-            </m:r>
-          </m:lim>
-        </m:limUpp>
+        </m:acc>
       </m:oMath>
       <w:r>
         <w:rPr>
@@ -6338,7 +6431,7 @@
     </w:p>
     <w:p>
       <w:pPr>
-        <w:spacing w:before="40" w:after="60" w:line="288" w:lineRule="auto"/>
+        <w:spacing w:before="40" w:after="20" w:line="288" w:lineRule="auto"/>
         <w:jc w:val="left"/>
       </w:pPr>
       <w:r>
@@ -6369,8 +6462,60 @@
           <w:color w:val="000000"/>
           <w:sz w:val="23"/>
         </w:rPr>
-        <w:t xml:space="preserve"> `-0,25` (hoặc `-0.25`)</w:t>
-        <w:br/>
+        <w:t xml:space="preserve"> </w:t>
+      </w:r>
+      <w:r>
+        <w:rPr>
+          <w:rFonts w:ascii="Consolas" w:hAnsi="Consolas"/>
+          <w:b/>
+          <w:color w:val="000000"/>
+          <w:sz w:val="23"/>
+        </w:rPr>
+        <w:t>-0,25</w:t>
+      </w:r>
+      <w:r>
+        <w:rPr>
+          <w:rFonts w:ascii="Times New Roman" w:hAnsi="Times New Roman"/>
+          <w:b w:val="0"/>
+          <w:i w:val="0"/>
+          <w:color w:val="000000"/>
+          <w:sz w:val="23"/>
+        </w:rPr>
+        <w:t xml:space="preserve"> (hoặc </w:t>
+      </w:r>
+      <w:r>
+        <w:rPr>
+          <w:rFonts w:ascii="Consolas" w:hAnsi="Consolas"/>
+          <w:b/>
+          <w:color w:val="000000"/>
+          <w:sz w:val="23"/>
+        </w:rPr>
+        <w:t>-0.25</w:t>
+      </w:r>
+      <w:r>
+        <w:rPr>
+          <w:rFonts w:ascii="Times New Roman" w:hAnsi="Times New Roman"/>
+          <w:b w:val="0"/>
+          <w:i w:val="0"/>
+          <w:color w:val="000000"/>
+          <w:sz w:val="23"/>
+        </w:rPr>
+        <w:t>)</w:t>
+      </w:r>
+    </w:p>
+    <w:p>
+      <w:pPr>
+        <w:spacing w:before="20" w:after="20" w:line="288" w:lineRule="auto"/>
+        <w:jc w:val="left"/>
+      </w:pPr>
+      <w:r>
+        <w:rPr>
+          <w:rFonts w:ascii="Times New Roman" w:hAnsi="Times New Roman"/>
+          <w:b w:val="0"/>
+          <w:i w:val="0"/>
+          <w:color w:val="000000"/>
+          <w:sz w:val="23"/>
+        </w:rPr>
         <w:t xml:space="preserve">• </w:t>
       </w:r>
       <w:r>
@@ -6391,7 +6536,26 @@
           <w:color w:val="000000"/>
           <w:sz w:val="23"/>
         </w:rPr>
-        <w:t xml:space="preserve"> `12` (Cạnh vườn hình vuông: </w:t>
+        <w:t xml:space="preserve"> </w:t>
+      </w:r>
+      <w:r>
+        <w:rPr>
+          <w:rFonts w:ascii="Consolas" w:hAnsi="Consolas"/>
+          <w:b/>
+          <w:color w:val="000000"/>
+          <w:sz w:val="23"/>
+        </w:rPr>
+        <w:t>12</w:t>
+      </w:r>
+      <w:r>
+        <w:rPr>
+          <w:rFonts w:ascii="Times New Roman" w:hAnsi="Times New Roman"/>
+          <w:b w:val="0"/>
+          <w:i w:val="0"/>
+          <w:color w:val="000000"/>
+          <w:sz w:val="23"/>
+        </w:rPr>
+        <w:t xml:space="preserve"> (Cạnh vườn hình vuông: </w:t>
       </w:r>
       <m:oMath xmlns:mml="http://www.w3.org/1998/Math/MathML">
         <m:rad>
@@ -6424,7 +6588,21 @@
           <w:sz w:val="23"/>
         </w:rPr>
         <w:t>)</w:t>
-        <w:br/>
+      </w:r>
+    </w:p>
+    <w:p>
+      <w:pPr>
+        <w:spacing w:before="20" w:after="20" w:line="288" w:lineRule="auto"/>
+        <w:jc w:val="left"/>
+      </w:pPr>
+      <w:r>
+        <w:rPr>
+          <w:rFonts w:ascii="Times New Roman" w:hAnsi="Times New Roman"/>
+          <w:b w:val="0"/>
+          <w:i w:val="0"/>
+          <w:color w:val="000000"/>
+          <w:sz w:val="23"/>
+        </w:rPr>
         <w:t xml:space="preserve">• </w:t>
       </w:r>
       <w:r>
@@ -6445,8 +6623,31 @@
           <w:color w:val="000000"/>
           <w:sz w:val="23"/>
         </w:rPr>
-        <w:t xml:space="preserve"> `7`</w:t>
-        <w:br/>
+        <w:t xml:space="preserve"> </w:t>
+      </w:r>
+      <w:r>
+        <w:rPr>
+          <w:rFonts w:ascii="Consolas" w:hAnsi="Consolas"/>
+          <w:b/>
+          <w:color w:val="000000"/>
+          <w:sz w:val="23"/>
+        </w:rPr>
+        <w:t>7</w:t>
+      </w:r>
+    </w:p>
+    <w:p>
+      <w:pPr>
+        <w:spacing w:before="20" w:after="60" w:line="288" w:lineRule="auto"/>
+        <w:jc w:val="left"/>
+      </w:pPr>
+      <w:r>
+        <w:rPr>
+          <w:rFonts w:ascii="Times New Roman" w:hAnsi="Times New Roman"/>
+          <w:b w:val="0"/>
+          <w:i w:val="0"/>
+          <w:color w:val="000000"/>
+          <w:sz w:val="23"/>
+        </w:rPr>
         <w:t xml:space="preserve">• </w:t>
       </w:r>
       <w:r>
@@ -6467,7 +6668,16 @@
           <w:color w:val="000000"/>
           <w:sz w:val="23"/>
         </w:rPr>
-        <w:t xml:space="preserve"> `2024`</w:t>
+        <w:t xml:space="preserve"> </w:t>
+      </w:r>
+      <w:r>
+        <w:rPr>
+          <w:rFonts w:ascii="Consolas" w:hAnsi="Consolas"/>
+          <w:b/>
+          <w:color w:val="000000"/>
+          <w:sz w:val="23"/>
+        </w:rPr>
+        <w:t>2024</w:t>
       </w:r>
     </w:p>
     <w:p>
@@ -6570,7 +6780,6 @@
             <w:tcW w:type="dxa" w:w="3120"/>
             <w:shd w:fill="F8FAFC"/>
           </w:tcPr>
-          <w:p/>
           <w:p>
             <w:pPr>
               <w:spacing w:before="40" w:after="60" w:line="288" w:lineRule="auto"/>
@@ -6593,7 +6802,6 @@
             <w:tcW w:type="dxa" w:w="3120"/>
             <w:shd w:fill="F8FAFC"/>
           </w:tcPr>
-          <w:p/>
           <w:p>
             <w:pPr>
               <w:spacing w:before="40" w:after="60" w:line="288" w:lineRule="auto"/>
@@ -6752,7 +6960,6 @@
             <w:tcW w:type="dxa" w:w="3120"/>
             <w:shd w:fill="F8FAFC"/>
           </w:tcPr>
-          <w:p/>
           <w:p>
             <w:pPr>
               <w:spacing w:before="40" w:after="60" w:line="288" w:lineRule="auto"/>
@@ -6776,7 +6983,6 @@
           <w:tcPr>
             <w:tcW w:type="dxa" w:w="3120"/>
           </w:tcPr>
-          <w:p/>
           <w:p>
             <w:pPr>
               <w:spacing w:before="40" w:after="60" w:line="288" w:lineRule="auto"/>
@@ -6798,10 +7004,9 @@
           <w:tcPr>
             <w:tcW w:type="dxa" w:w="3120"/>
           </w:tcPr>
-          <w:p/>
           <w:p>
             <w:pPr>
-              <w:spacing w:before="40" w:after="60" w:line="288" w:lineRule="auto"/>
+              <w:spacing w:before="40" w:after="20" w:line="288" w:lineRule="auto"/>
               <w:jc w:val="left"/>
             </w:pPr>
             <m:oMath xmlns:mml="http://www.w3.org/1998/Math/MathML">
@@ -6938,6 +7143,12 @@
                 </m:den>
               </m:f>
             </m:oMath>
+          </w:p>
+          <w:p>
+            <w:pPr>
+              <w:spacing w:before="20" w:after="20" w:line="288" w:lineRule="auto"/>
+              <w:jc w:val="left"/>
+            </w:pPr>
             <w:r>
               <w:rPr>
                 <w:rFonts w:ascii="Times New Roman" w:hAnsi="Times New Roman"/>
@@ -6946,7 +7157,6 @@
                 <w:color w:val="000000"/>
                 <w:sz w:val="22"/>
               </w:rPr>
-              <w:br/>
               <w:t xml:space="preserve">• TH1: </w:t>
             </w:r>
             <m:oMath xmlns:mml="http://www.w3.org/1998/Math/MathML">
@@ -6996,7 +7206,21 @@
                 <w:sz w:val="22"/>
               </w:rPr>
               <w:t xml:space="preserve"> (0,25 đ)</w:t>
-              <w:br/>
+            </w:r>
+          </w:p>
+          <w:p>
+            <w:pPr>
+              <w:spacing w:before="20" w:after="60" w:line="288" w:lineRule="auto"/>
+              <w:jc w:val="left"/>
+            </w:pPr>
+            <w:r>
+              <w:rPr>
+                <w:rFonts w:ascii="Times New Roman" w:hAnsi="Times New Roman"/>
+                <w:b w:val="0"/>
+                <w:i w:val="0"/>
+                <w:color w:val="000000"/>
+                <w:sz w:val="22"/>
+              </w:rPr>
               <w:t xml:space="preserve">• TH2: </w:t>
             </w:r>
             <m:oMath xmlns:mml="http://www.w3.org/1998/Math/MathML">
@@ -7035,7 +7259,6 @@
           <w:tcPr>
             <w:tcW w:type="dxa" w:w="3120"/>
           </w:tcPr>
-          <w:p/>
           <w:p>
             <w:pPr>
               <w:spacing w:before="40" w:after="60" w:line="288" w:lineRule="auto"/>
@@ -7060,7 +7283,6 @@
             <w:tcW w:type="dxa" w:w="3120"/>
             <w:shd w:fill="F8FAFC"/>
           </w:tcPr>
-          <w:p/>
           <w:p>
             <w:pPr>
               <w:spacing w:before="40" w:after="60" w:line="288" w:lineRule="auto"/>
@@ -7083,10 +7305,9 @@
             <w:tcW w:type="dxa" w:w="3120"/>
             <w:shd w:fill="F8FAFC"/>
           </w:tcPr>
-          <w:p/>
           <w:p>
             <w:pPr>
-              <w:spacing w:before="40" w:after="60" w:line="288" w:lineRule="auto"/>
+              <w:spacing w:before="40" w:after="20" w:line="288" w:lineRule="auto"/>
               <w:jc w:val="left"/>
             </w:pPr>
             <w:r>
@@ -7104,7 +7325,13 @@
                 <m:t>500</m:t>
               </m:r>
               <m:r>
-                <m:t>000×1,2=600</m:t>
+                <m:t>000×1</m:t>
+              </m:r>
+              <m:r>
+                <m:t>,</m:t>
+              </m:r>
+              <m:r>
+                <m:t>2=600</m:t>
               </m:r>
               <m:r>
                 <m:t>000</m:t>
@@ -7119,7 +7346,21 @@
                 <w:sz w:val="22"/>
               </w:rPr>
               <w:t xml:space="preserve"> (đồng)</w:t>
-              <w:br/>
+            </w:r>
+          </w:p>
+          <w:p>
+            <w:pPr>
+              <w:spacing w:before="20" w:after="60" w:line="288" w:lineRule="auto"/>
+              <w:jc w:val="left"/>
+            </w:pPr>
+            <w:r>
+              <w:rPr>
+                <w:rFonts w:ascii="Times New Roman" w:hAnsi="Times New Roman"/>
+                <w:b w:val="0"/>
+                <w:i w:val="0"/>
+                <w:color w:val="000000"/>
+                <w:sz w:val="22"/>
+              </w:rPr>
               <w:t xml:space="preserve">• Giá bán 1 máy Đợt 2: </w:t>
             </w:r>
             <m:oMath xmlns:mml="http://www.w3.org/1998/Math/MathML">
@@ -7127,7 +7368,13 @@
                 <m:t>600</m:t>
               </m:r>
               <m:r>
-                <m:t>000×0,85=510</m:t>
+                <m:t>000×0</m:t>
+              </m:r>
+              <m:r>
+                <m:t>,</m:t>
+              </m:r>
+              <m:r>
+                <m:t>85=510</m:t>
               </m:r>
               <m:r>
                 <m:t>000</m:t>
@@ -7150,7 +7397,6 @@
             <w:tcW w:type="dxa" w:w="3120"/>
             <w:shd w:fill="F8FAFC"/>
           </w:tcPr>
-          <w:p/>
           <w:p>
             <w:pPr>
               <w:spacing w:before="40" w:after="60" w:line="288" w:lineRule="auto"/>
@@ -7174,7 +7420,6 @@
           <w:tcPr>
             <w:tcW w:type="dxa" w:w="3120"/>
           </w:tcPr>
-          <w:p/>
           <w:p>
             <w:pPr>
               <w:spacing w:before="40" w:after="60" w:line="288" w:lineRule="auto"/>
@@ -7196,10 +7441,9 @@
           <w:tcPr>
             <w:tcW w:type="dxa" w:w="3120"/>
           </w:tcPr>
-          <w:p/>
           <w:p>
             <w:pPr>
-              <w:spacing w:before="40" w:after="60" w:line="288" w:lineRule="auto"/>
+              <w:spacing w:before="40" w:after="20" w:line="288" w:lineRule="auto"/>
               <w:jc w:val="left"/>
             </w:pPr>
             <w:r>
@@ -7235,7 +7479,21 @@
                 <w:sz w:val="22"/>
               </w:rPr>
               <w:t xml:space="preserve"> đồng</w:t>
-              <w:br/>
+            </w:r>
+          </w:p>
+          <w:p>
+            <w:pPr>
+              <w:spacing w:before="20" w:after="20" w:line="288" w:lineRule="auto"/>
+              <w:jc w:val="left"/>
+            </w:pPr>
+            <w:r>
+              <w:rPr>
+                <w:rFonts w:ascii="Times New Roman" w:hAnsi="Times New Roman"/>
+                <w:b w:val="0"/>
+                <w:i w:val="0"/>
+                <w:color w:val="000000"/>
+                <w:sz w:val="22"/>
+              </w:rPr>
               <w:t xml:space="preserve">• Doanh thu: </w:t>
             </w:r>
             <m:oMath xmlns:mml="http://www.w3.org/1998/Math/MathML">
@@ -7264,7 +7522,21 @@
                 <w:sz w:val="22"/>
               </w:rPr>
               <w:t xml:space="preserve"> đồng</w:t>
-              <w:br/>
+            </w:r>
+          </w:p>
+          <w:p>
+            <w:pPr>
+              <w:spacing w:before="20" w:after="60" w:line="288" w:lineRule="auto"/>
+              <w:jc w:val="left"/>
+            </w:pPr>
+            <w:r>
+              <w:rPr>
+                <w:rFonts w:ascii="Times New Roman" w:hAnsi="Times New Roman"/>
+                <w:b w:val="0"/>
+                <w:i w:val="0"/>
+                <w:color w:val="000000"/>
+                <w:sz w:val="22"/>
+              </w:rPr>
               <w:t xml:space="preserve">• Tiền lãi: </w:t>
             </w:r>
             <m:oMath xmlns:mml="http://www.w3.org/1998/Math/MathML">
@@ -7306,7 +7578,6 @@
           <w:tcPr>
             <w:tcW w:type="dxa" w:w="3120"/>
           </w:tcPr>
-          <w:p/>
           <w:p>
             <w:pPr>
               <w:spacing w:before="40" w:after="60" w:line="288" w:lineRule="auto"/>
@@ -7331,7 +7602,6 @@
             <w:tcW w:type="dxa" w:w="3120"/>
             <w:shd w:fill="F8FAFC"/>
           </w:tcPr>
-          <w:p/>
           <w:p>
             <w:pPr>
               <w:spacing w:before="40" w:after="60" w:line="288" w:lineRule="auto"/>
@@ -7354,10 +7624,9 @@
             <w:tcW w:type="dxa" w:w="3120"/>
             <w:shd w:fill="F8FAFC"/>
           </w:tcPr>
-          <w:p/>
           <w:p>
             <w:pPr>
-              <w:spacing w:before="40" w:after="60" w:line="288" w:lineRule="auto"/>
+              <w:spacing w:before="40" w:after="20" w:line="288" w:lineRule="auto"/>
               <w:jc w:val="left"/>
             </w:pPr>
             <w:r>
@@ -7371,22 +7640,23 @@
               <w:t xml:space="preserve">• Vẽ hình đúng, chỉ ra </w:t>
             </w:r>
             <m:oMath xmlns:mml="http://www.w3.org/1998/Math/MathML">
-              <m:limUpp>
+              <m:acc>
+                <m:accPr>
+                  <m:chr m:val="̂"/>
+                </m:accPr>
                 <m:e>
                   <m:r>
                     <m:t>xAB</m:t>
                   </m:r>
                 </m:e>
-                <m:lim>
-                  <m:r>
-                    <m:t>^</m:t>
-                  </m:r>
-                </m:lim>
-              </m:limUpp>
+              </m:acc>
               <m:r>
                 <m:t>=</m:t>
               </m:r>
-              <m:limUpp>
+              <m:acc>
+                <m:accPr>
+                  <m:chr m:val="̂"/>
+                </m:accPr>
                 <m:e>
                   <m:r>
                     <m:t>AB</m:t>
@@ -7404,12 +7674,7 @@
                     </m:sup>
                   </m:sSup>
                 </m:e>
-                <m:lim>
-                  <m:r>
-                    <m:t>^</m:t>
-                  </m:r>
-                </m:lim>
-              </m:limUpp>
+              </m:acc>
               <m:r>
                 <m:t>=</m:t>
               </m:r>
@@ -7435,7 +7700,21 @@
                 <w:sz w:val="22"/>
               </w:rPr>
               <w:t xml:space="preserve"> ở vị trí so le trong</w:t>
-              <w:br/>
+            </w:r>
+          </w:p>
+          <w:p>
+            <w:pPr>
+              <w:spacing w:before="20" w:after="60" w:line="288" w:lineRule="auto"/>
+              <w:jc w:val="left"/>
+            </w:pPr>
+            <w:r>
+              <w:rPr>
+                <w:rFonts w:ascii="Times New Roman" w:hAnsi="Times New Roman"/>
+                <w:b w:val="0"/>
+                <w:i w:val="0"/>
+                <w:color w:val="000000"/>
+                <w:sz w:val="22"/>
+              </w:rPr>
               <w:t xml:space="preserve">• Theo dấu hiệu nhận biết </w:t>
             </w:r>
             <m:oMath xmlns:mml="http://www.w3.org/1998/Math/MathML">
@@ -7450,7 +7729,6 @@
             <w:tcW w:type="dxa" w:w="3120"/>
             <w:shd w:fill="F8FAFC"/>
           </w:tcPr>
-          <w:p/>
           <w:p>
             <w:pPr>
               <w:spacing w:before="40" w:after="60" w:line="288" w:lineRule="auto"/>
@@ -7474,7 +7752,6 @@
           <w:tcPr>
             <w:tcW w:type="dxa" w:w="3120"/>
           </w:tcPr>
-          <w:p/>
           <w:p>
             <w:pPr>
               <w:spacing w:before="40" w:after="60" w:line="288" w:lineRule="auto"/>
@@ -7496,10 +7773,9 @@
           <w:tcPr>
             <w:tcW w:type="dxa" w:w="3120"/>
           </w:tcPr>
-          <w:p/>
           <w:p>
             <w:pPr>
-              <w:spacing w:before="40" w:after="60" w:line="288" w:lineRule="auto"/>
+              <w:spacing w:before="40" w:after="20" w:line="288" w:lineRule="auto"/>
               <w:jc w:val="left"/>
             </w:pPr>
             <w:r>
@@ -7531,18 +7807,16 @@
               <m:r>
                 <m:t>⇒</m:t>
               </m:r>
-              <m:limUpp>
+              <m:acc>
+                <m:accPr>
+                  <m:chr m:val="̂"/>
+                </m:accPr>
                 <m:e>
                   <m:r>
                     <m:t>mAB</m:t>
                   </m:r>
                 </m:e>
-                <m:lim>
-                  <m:r>
-                    <m:t>^</m:t>
-                  </m:r>
-                </m:lim>
-              </m:limUpp>
+              </m:acc>
               <m:r>
                 <m:t>=</m:t>
               </m:r>
@@ -7588,18 +7862,16 @@
               <m:r>
                 <m:t>⇒</m:t>
               </m:r>
-              <m:limUpp>
+              <m:acc>
+                <m:accPr>
+                  <m:chr m:val="̂"/>
+                </m:accPr>
                 <m:e>
                   <m:r>
                     <m:t>nBA</m:t>
                   </m:r>
                 </m:e>
-                <m:lim>
-                  <m:r>
-                    <m:t>^</m:t>
-                  </m:r>
-                </m:lim>
-              </m:limUpp>
+              </m:acc>
               <m:r>
                 <m:t>=</m:t>
               </m:r>
@@ -7616,6 +7888,12 @@
                 </m:sup>
               </m:sSup>
             </m:oMath>
+          </w:p>
+          <w:p>
+            <w:pPr>
+              <w:spacing w:before="20" w:after="60" w:line="288" w:lineRule="auto"/>
+              <w:jc w:val="left"/>
+            </w:pPr>
             <w:r>
               <w:rPr>
                 <w:rFonts w:ascii="Times New Roman" w:hAnsi="Times New Roman"/>
@@ -7624,37 +7902,32 @@
                 <w:color w:val="000000"/>
                 <w:sz w:val="22"/>
               </w:rPr>
-              <w:br/>
               <w:t xml:space="preserve">• Suy ra </w:t>
             </w:r>
             <m:oMath xmlns:mml="http://www.w3.org/1998/Math/MathML">
-              <m:limUpp>
+              <m:acc>
+                <m:accPr>
+                  <m:chr m:val="̂"/>
+                </m:accPr>
                 <m:e>
                   <m:r>
                     <m:t>mAB</m:t>
                   </m:r>
                 </m:e>
-                <m:lim>
-                  <m:r>
-                    <m:t>^</m:t>
-                  </m:r>
-                </m:lim>
-              </m:limUpp>
+              </m:acc>
               <m:r>
                 <m:t>=</m:t>
               </m:r>
-              <m:limUpp>
+              <m:acc>
+                <m:accPr>
+                  <m:chr m:val="̂"/>
+                </m:accPr>
                 <m:e>
                   <m:r>
                     <m:t>nBA</m:t>
                   </m:r>
                 </m:e>
-                <m:lim>
-                  <m:r>
-                    <m:t>^</m:t>
-                  </m:r>
-                </m:lim>
-              </m:limUpp>
+              </m:acc>
               <m:r>
                 <m:t>=</m:t>
               </m:r>
@@ -7692,7 +7965,6 @@
           <w:tcPr>
             <w:tcW w:type="dxa" w:w="3120"/>
           </w:tcPr>
-          <w:p/>
           <w:p>
             <w:pPr>
               <w:spacing w:before="40" w:after="60" w:line="288" w:lineRule="auto"/>
@@ -7717,7 +7989,6 @@
             <w:tcW w:type="dxa" w:w="3120"/>
             <w:shd w:fill="F8FAFC"/>
           </w:tcPr>
-          <w:p/>
           <w:p>
             <w:pPr>
               <w:spacing w:before="40" w:after="60" w:line="288" w:lineRule="auto"/>
@@ -7740,7 +8011,6 @@
             <w:tcW w:type="dxa" w:w="3120"/>
             <w:shd w:fill="F8FAFC"/>
           </w:tcPr>
-          <w:p/>
           <w:p>
             <w:pPr>
               <w:spacing w:before="40" w:after="60" w:line="288" w:lineRule="auto"/>
@@ -7763,7 +8033,6 @@
             <w:tcW w:type="dxa" w:w="3120"/>
             <w:shd w:fill="F8FAFC"/>
           </w:tcPr>
-          <w:p/>
           <w:p>
             <w:pPr>
               <w:spacing w:before="40" w:after="60" w:line="288" w:lineRule="auto"/>

</xml_diff>